<commit_message>
Replace M1 workbook with no-lines version
</commit_message>
<xml_diff>
--- a/Cuadernillo_Participante_M1_Historia_Fundamentos_HVAC_BDZ_2026.docx
+++ b/Cuadernillo_Participante_M1_Historia_Fundamentos_HVAC_BDZ_2026.docx
@@ -92,6 +92,9 @@
         <w:gridCol w:w="5298"/>
       </w:tblGrid>
       <w:tr>
+        <w:trPr>
+          <w:trHeight w:val="547" w:hRule="atLeast"/>
+        </w:trPr>
         <w:tc>
           <w:tcPr>
             <w:tcW w:type="dxa" w:w="2376"/>
@@ -128,19 +131,23 @@
             </w:tcBorders>
           </w:tcPr>
           <w:p>
-            <w:r/>
+            <w:r>
+              <w:t xml:space="preserve"> </w:t>
+            </w:r>
             <w:r>
               <w:rPr>
                 <w:b w:val="0"/>
                 <w:color w:val="000000"/>
                 <w:sz w:val="17"/>
               </w:rPr>
-              <w:t>____________________________________________________________</w:t>
             </w:r>
           </w:p>
         </w:tc>
       </w:tr>
       <w:tr>
+        <w:trPr>
+          <w:trHeight w:val="547" w:hRule="atLeast"/>
+        </w:trPr>
         <w:tc>
           <w:tcPr>
             <w:tcW w:type="dxa" w:w="2376"/>
@@ -177,19 +184,23 @@
             </w:tcBorders>
           </w:tcPr>
           <w:p>
-            <w:r/>
+            <w:r>
+              <w:t xml:space="preserve"> </w:t>
+            </w:r>
             <w:r>
               <w:rPr>
                 <w:b w:val="0"/>
                 <w:color w:val="000000"/>
                 <w:sz w:val="17"/>
               </w:rPr>
-              <w:t>____________________________________________________________</w:t>
             </w:r>
           </w:p>
         </w:tc>
       </w:tr>
       <w:tr>
+        <w:trPr>
+          <w:trHeight w:val="547" w:hRule="atLeast"/>
+        </w:trPr>
         <w:tc>
           <w:tcPr>
             <w:tcW w:type="dxa" w:w="2376"/>
@@ -226,14 +237,15 @@
             </w:tcBorders>
           </w:tcPr>
           <w:p>
-            <w:r/>
+            <w:r>
+              <w:t xml:space="preserve"> </w:t>
+            </w:r>
             <w:r>
               <w:rPr>
                 <w:b w:val="0"/>
                 <w:color w:val="000000"/>
                 <w:sz w:val="17"/>
               </w:rPr>
-              <w:t>____________________________________________________________</w:t>
             </w:r>
           </w:p>
         </w:tc>
@@ -3370,6 +3382,9 @@
         <w:gridCol w:w="10596"/>
       </w:tblGrid>
       <w:tr>
+        <w:trPr>
+          <w:trHeight w:val="1368" w:hRule="atLeast"/>
+        </w:trPr>
         <w:tc>
           <w:tcPr>
             <w:tcW w:type="dxa" w:w="10596"/>
@@ -3388,7 +3403,7 @@
               <w:rPr>
                 <w:sz w:val="16"/>
               </w:rPr>
-              <w:t>____________________________________________________________</w:t>
+              <w:t xml:space="preserve"> </w:t>
             </w:r>
           </w:p>
           <w:p>
@@ -3399,7 +3414,6 @@
               <w:rPr>
                 <w:sz w:val="16"/>
               </w:rPr>
-              <w:t>____________________________________________________________</w:t>
             </w:r>
           </w:p>
           <w:p>
@@ -3410,7 +3424,6 @@
               <w:rPr>
                 <w:sz w:val="16"/>
               </w:rPr>
-              <w:t>____________________________________________________________</w:t>
             </w:r>
           </w:p>
         </w:tc>
@@ -5799,7 +5812,7 @@
         <w:rPr>
           <w:sz w:val="18"/>
         </w:rPr>
-        <w:t>1. Un equipo de 12,000 BTU/h equivale a: ______ TR.</w:t>
+        <w:t>1. Un equipo de 12,000 BTU/h equivale a:  TR.</w:t>
       </w:r>
     </w:p>
     <w:p>
@@ -5810,7 +5823,7 @@
         <w:rPr>
           <w:sz w:val="18"/>
         </w:rPr>
-        <w:t>2. Un equipo de 24,000 BTU/h equivale a: ______ TR.</w:t>
+        <w:t>2. Un equipo de 24,000 BTU/h equivale a:  TR.</w:t>
       </w:r>
     </w:p>
     <w:p>
@@ -5821,7 +5834,7 @@
         <w:rPr>
           <w:sz w:val="18"/>
         </w:rPr>
-        <w:t>3. Si un equipo tiene COP = 4.0, significa que por cada 1 kW eléctrico entrega aproximadamente ______ kW térmicos.</w:t>
+        <w:t>3. Si un equipo tiene COP = 4.0, significa que por cada 1 kW eléctrico entrega aproximadamente  kW térmicos.</w:t>
       </w:r>
     </w:p>
     <w:p>
@@ -5832,7 +5845,7 @@
         <w:rPr>
           <w:sz w:val="18"/>
         </w:rPr>
-        <w:t>4. Menciona dos datos que necesitarías antes de seleccionar un equipo para un local: ________________________________ y ________________________________.</w:t>
+        <w:t>4. Menciona dos datos que necesitarías antes de seleccionar un equipo para un local:  y .</w:t>
       </w:r>
     </w:p>
     <w:p>
@@ -5948,6 +5961,9 @@
         </w:tc>
       </w:tr>
       <w:tr>
+        <w:trPr>
+          <w:trHeight w:val="749" w:hRule="atLeast"/>
+        </w:trPr>
         <w:tc>
           <w:tcPr>
             <w:tcW w:type="dxa" w:w="4320"/>
@@ -5999,7 +6015,7 @@
               <w:rPr>
                 <w:sz w:val="15"/>
               </w:rPr>
-              <w:t>____________________________________________________________</w:t>
+              <w:t xml:space="preserve"> </w:t>
             </w:r>
           </w:p>
           <w:p>
@@ -6010,12 +6026,14 @@
               <w:rPr>
                 <w:sz w:val="15"/>
               </w:rPr>
-              <w:t>____________________________________________________________</w:t>
             </w:r>
           </w:p>
         </w:tc>
       </w:tr>
       <w:tr>
+        <w:trPr>
+          <w:trHeight w:val="749" w:hRule="atLeast"/>
+        </w:trPr>
         <w:tc>
           <w:tcPr>
             <w:tcW w:type="dxa" w:w="4320"/>
@@ -6067,7 +6085,7 @@
               <w:rPr>
                 <w:sz w:val="15"/>
               </w:rPr>
-              <w:t>____________________________________________________________</w:t>
+              <w:t xml:space="preserve"> </w:t>
             </w:r>
           </w:p>
           <w:p>
@@ -6078,12 +6096,14 @@
               <w:rPr>
                 <w:sz w:val="15"/>
               </w:rPr>
-              <w:t>____________________________________________________________</w:t>
             </w:r>
           </w:p>
         </w:tc>
       </w:tr>
       <w:tr>
+        <w:trPr>
+          <w:trHeight w:val="749" w:hRule="atLeast"/>
+        </w:trPr>
         <w:tc>
           <w:tcPr>
             <w:tcW w:type="dxa" w:w="4320"/>
@@ -6135,7 +6155,7 @@
               <w:rPr>
                 <w:sz w:val="15"/>
               </w:rPr>
-              <w:t>____________________________________________________________</w:t>
+              <w:t xml:space="preserve"> </w:t>
             </w:r>
           </w:p>
           <w:p>
@@ -6146,12 +6166,14 @@
               <w:rPr>
                 <w:sz w:val="15"/>
               </w:rPr>
-              <w:t>____________________________________________________________</w:t>
             </w:r>
           </w:p>
         </w:tc>
       </w:tr>
       <w:tr>
+        <w:trPr>
+          <w:trHeight w:val="749" w:hRule="atLeast"/>
+        </w:trPr>
         <w:tc>
           <w:tcPr>
             <w:tcW w:type="dxa" w:w="4320"/>
@@ -6203,7 +6225,7 @@
               <w:rPr>
                 <w:sz w:val="15"/>
               </w:rPr>
-              <w:t>____________________________________________________________</w:t>
+              <w:t xml:space="preserve"> </w:t>
             </w:r>
           </w:p>
           <w:p>
@@ -6214,7 +6236,6 @@
               <w:rPr>
                 <w:sz w:val="15"/>
               </w:rPr>
-              <w:t>____________________________________________________________</w:t>
             </w:r>
           </w:p>
         </w:tc>
@@ -6927,6 +6948,9 @@
         <w:gridCol w:w="10596"/>
       </w:tblGrid>
       <w:tr>
+        <w:trPr>
+          <w:trHeight w:val="1008" w:hRule="atLeast"/>
+        </w:trPr>
         <w:tc>
           <w:tcPr>
             <w:tcW w:type="dxa" w:w="10596"/>
@@ -6945,7 +6969,7 @@
               <w:rPr>
                 <w:sz w:val="16"/>
               </w:rPr>
-              <w:t>____________________________________________________________</w:t>
+              <w:t xml:space="preserve"> </w:t>
             </w:r>
           </w:p>
           <w:p>
@@ -6956,7 +6980,6 @@
               <w:rPr>
                 <w:sz w:val="16"/>
               </w:rPr>
-              <w:t>____________________________________________________________</w:t>
             </w:r>
           </w:p>
           <w:p>
@@ -6967,7 +6990,6 @@
               <w:rPr>
                 <w:sz w:val="16"/>
               </w:rPr>
-              <w:t>____________________________________________________________</w:t>
             </w:r>
           </w:p>
           <w:p>
@@ -6978,7 +7000,6 @@
               <w:rPr>
                 <w:sz w:val="16"/>
               </w:rPr>
-              <w:t>____________________________________________________________</w:t>
             </w:r>
           </w:p>
           <w:p>
@@ -6989,7 +7010,6 @@
               <w:rPr>
                 <w:sz w:val="16"/>
               </w:rPr>
-              <w:t>____________________________________________________________</w:t>
             </w:r>
           </w:p>
           <w:p>
@@ -7000,7 +7020,6 @@
               <w:rPr>
                 <w:sz w:val="16"/>
               </w:rPr>
-              <w:t>____________________________________________________________</w:t>
             </w:r>
           </w:p>
           <w:p>
@@ -7011,7 +7030,6 @@
               <w:rPr>
                 <w:sz w:val="16"/>
               </w:rPr>
-              <w:t>____________________________________________________________</w:t>
             </w:r>
           </w:p>
           <w:p>
@@ -7022,7 +7040,6 @@
               <w:rPr>
                 <w:sz w:val="16"/>
               </w:rPr>
-              <w:t>____________________________________________________________</w:t>
             </w:r>
           </w:p>
           <w:p>
@@ -7033,7 +7050,6 @@
               <w:rPr>
                 <w:sz w:val="16"/>
               </w:rPr>
-              <w:t>____________________________________________________________</w:t>
             </w:r>
           </w:p>
           <w:p>
@@ -7044,7 +7060,6 @@
               <w:rPr>
                 <w:sz w:val="16"/>
               </w:rPr>
-              <w:t>____________________________________________________________</w:t>
             </w:r>
           </w:p>
           <w:p>
@@ -7055,7 +7070,6 @@
               <w:rPr>
                 <w:sz w:val="16"/>
               </w:rPr>
-              <w:t>____________________________________________________________</w:t>
             </w:r>
           </w:p>
         </w:tc>
@@ -7098,6 +7112,9 @@
         <w:gridCol w:w="5298"/>
       </w:tblGrid>
       <w:tr>
+        <w:trPr>
+          <w:trHeight w:val="893" w:hRule="atLeast"/>
+        </w:trPr>
         <w:tc>
           <w:tcPr>
             <w:tcW w:type="dxa" w:w="3456"/>
@@ -7149,6 +7166,7 @@
               <w:rPr>
                 <w:sz w:val="16"/>
               </w:rPr>
+              <w:t xml:space="preserve"> </w:t>
             </w:r>
             <w:r>
               <w:rPr>
@@ -7156,16 +7174,14 @@
                 <w:color w:val="000000"/>
                 <w:sz w:val="16"/>
               </w:rPr>
-              <w:t>1. ________________________________</w:t>
-              <w:br/>
-              <w:t>2. ________________________________</w:t>
-              <w:br/>
-              <w:t>3. ________________________________</w:t>
             </w:r>
           </w:p>
         </w:tc>
       </w:tr>
       <w:tr>
+        <w:trPr>
+          <w:trHeight w:val="490" w:hRule="atLeast"/>
+        </w:trPr>
         <w:tc>
           <w:tcPr>
             <w:tcW w:type="dxa" w:w="3456"/>
@@ -7217,6 +7233,7 @@
               <w:rPr>
                 <w:sz w:val="16"/>
               </w:rPr>
+              <w:t xml:space="preserve"> </w:t>
             </w:r>
             <w:r>
               <w:rPr>
@@ -7224,12 +7241,14 @@
                 <w:color w:val="000000"/>
                 <w:sz w:val="16"/>
               </w:rPr>
-              <w:t>________________________________</w:t>
             </w:r>
           </w:p>
         </w:tc>
       </w:tr>
       <w:tr>
+        <w:trPr>
+          <w:trHeight w:val="490" w:hRule="atLeast"/>
+        </w:trPr>
         <w:tc>
           <w:tcPr>
             <w:tcW w:type="dxa" w:w="3456"/>
@@ -7281,6 +7300,7 @@
               <w:rPr>
                 <w:sz w:val="16"/>
               </w:rPr>
+              <w:t xml:space="preserve"> </w:t>
             </w:r>
             <w:r>
               <w:rPr>
@@ -7288,12 +7308,14 @@
                 <w:color w:val="000000"/>
                 <w:sz w:val="16"/>
               </w:rPr>
-              <w:t>________________________________</w:t>
             </w:r>
           </w:p>
         </w:tc>
       </w:tr>
       <w:tr>
+        <w:trPr>
+          <w:trHeight w:val="490" w:hRule="atLeast"/>
+        </w:trPr>
         <w:tc>
           <w:tcPr>
             <w:tcW w:type="dxa" w:w="3456"/>
@@ -7345,6 +7367,7 @@
               <w:rPr>
                 <w:sz w:val="16"/>
               </w:rPr>
+              <w:t xml:space="preserve"> </w:t>
             </w:r>
             <w:r>
               <w:rPr>
@@ -7352,7 +7375,6 @@
                 <w:color w:val="000000"/>
                 <w:sz w:val="16"/>
               </w:rPr>
-              <w:t>________________________________</w:t>
             </w:r>
           </w:p>
         </w:tc>

</xml_diff>